<commit_message>
pres+doc(mt25): alinear con pitch deck de referencia y consigna
- Propósito reencuadrado como Comunidad COTO (frase de la góndola/servicios)
- "Qué pierde COTO" vuelve a las 4 viñetas originales (Flexibilidad en vez
  de Cero control, sin el 5to punto de financiamiento)
- Saca la referencia a la Clase 1 de MT25 (caso Movistar)
- Solución pasa a los 4 pilares del deck (suma Coto Digital y Nuevos
  servicios financieros)
- Saca la sección de Customer Journey (no pedida por la consigna)
- Reordena Evolutivos y Riesgos después del Anexo — quedan fuera de los 5
  puntos que pide la consigna (problema/tamaño, creación de valor, captura
  de valor, ejecución, financials)
- Suma cotopay.pdf como referencia del pitch deck final

Co-Authored-By: Claude Sonnet 5 <noreply@anthropic.com>
</commit_message>
<xml_diff>
--- a/materias/mt25-estrategias-negocios-internet/business-plan-coto/entregable/presentacion/guion.docx
+++ b/materias/mt25-estrategias-negocios-internet/business-plan-coto/entregable/presentacion/guion.docx
@@ -28,13 +28,13 @@
         </w:p>
       </w:sdtContent>
     </w:sdt>
-    <w:bookmarkStart w:id="23" w:name="guion-del-pitch-wallet-coto"/>
+    <w:bookmarkStart w:id="23" w:name="guion-del-pitch-cotopay"/>
     <w:p>
       <w:pPr>
         <w:pStyle w:val="Heading1"/>
       </w:pPr>
       <w:r>
-        <w:t xml:space="preserve">Guion del pitch — Wallet COTO</w:t>
+        <w:t xml:space="preserve">Guion del pitch — CotoPay</w:t>
       </w:r>
     </w:p>
     <w:p>
@@ -121,13 +121,13 @@
         <w:t xml:space="preserve">nunca se presenta un supuesto como hecho frente al panel.</w:t>
       </w:r>
     </w:p>
-    <w:bookmarkStart w:id="9" w:name="Xe0eb23b52a72527f442724016d4d4593be7c93d"/>
+    <w:bookmarkStart w:id="9" w:name="X0e71f4052f0c426e60b0f4852621515138c995f"/>
     <w:p>
       <w:pPr>
         <w:pStyle w:val="Heading2"/>
       </w:pPr>
       <w:r>
-        <w:t xml:space="preserve">Cómo repartir por integrante (placeholder, sin nombres reales)</w:t>
+        <w:t xml:space="preserve">Reparto — equipo de 6 (Mariana, Andres, Diego, Luciano, Agustin, Emma)</w:t>
       </w:r>
     </w:p>
     <w:p>
@@ -135,41 +135,31 @@
         <w:pStyle w:val="FirstParagraph"/>
       </w:pPr>
       <w:r>
-        <w:t xml:space="preserve">El documento final marca en su §2 que no hay datos reales del equipo</w:t>
-      </w:r>
-      <w:r>
-        <w:t xml:space="preserve"> </w:t>
-      </w:r>
-      <w:r>
-        <w:t xml:space="preserve">todavía — este guion no los inventa. Para facilitar el reparto una vez que</w:t>
-      </w:r>
-      <w:r>
-        <w:t xml:space="preserve"> </w:t>
-      </w:r>
-      <w:r>
-        <w:t xml:space="preserve">el equipo esté confirmado, las 12 secciones se agrupan en</w:t>
-      </w:r>
-      <w:r>
-        <w:t xml:space="preserve"> </w:t>
-      </w:r>
-      <w:r>
-        <w:rPr>
-          <w:b/>
-          <w:bCs/>
-        </w:rPr>
-        <w:t xml:space="preserve">3 bloques</w:t>
-      </w:r>
-      <w:r>
-        <w:t xml:space="preserve"> </w:t>
-      </w:r>
-      <w:r>
-        <w:t xml:space="preserve">pensados para 3 presentadores (se puede subdividir más si el equipo es más</w:t>
-      </w:r>
-      <w:r>
-        <w:t xml:space="preserve"> </w:t>
-      </w:r>
-      <w:r>
-        <w:t xml:space="preserve">grande, o menos si presenta una sola persona):</w:t>
+        <w:t xml:space="preserve">Las 12 secciones se dividen en 6 bloques para que hable cada integrante.</w:t>
+      </w:r>
+      <w:r>
+        <w:t xml:space="preserve"> </w:t>
+      </w:r>
+      <w:r>
+        <w:t xml:space="preserve">Los bloques respetan la lógica narrativa del pitch — cada persona recibe</w:t>
+      </w:r>
+      <w:r>
+        <w:t xml:space="preserve"> </w:t>
+      </w:r>
+      <w:r>
+        <w:t xml:space="preserve">un</w:t>
+      </w:r>
+      <w:r>
+        <w:t xml:space="preserve"> </w:t>
+      </w:r>
+      <w:r>
+        <w:t xml:space="preserve">“arco”</w:t>
+      </w:r>
+      <w:r>
+        <w:t xml:space="preserve"> </w:t>
+      </w:r>
+      <w:r>
+        <w:t xml:space="preserve">completo, no una lista de datos sueltos:</w:t>
       </w:r>
     </w:p>
     <w:tbl>
@@ -253,7 +243,7 @@
                 <w:b/>
                 <w:color w:val="FFFFFF"/>
               </w:rPr>
-              <w:t xml:space="preserve">Tema central</w:t>
+              <w:t xml:space="preserve">Tema</w:t>
             </w:r>
           </w:p>
         </w:tc>
@@ -272,13 +262,7 @@
                 <w:b/>
                 <w:bCs/>
               </w:rPr>
-              <w:t xml:space="preserve">Bloque A</w:t>
-            </w:r>
-            <w:r>
-              <w:t xml:space="preserve"> </w:t>
-            </w:r>
-            <w:r>
-              <w:t xml:space="preserve">— Presentador 1</w:t>
+              <w:t xml:space="preserve">Bloque 1</w:t>
             </w:r>
           </w:p>
         </w:tc>
@@ -291,7 +275,7 @@
               <w:pStyle w:val="Compact"/>
             </w:pPr>
             <w:r>
-              <w:t xml:space="preserve">1–5 (Nombre, Equipo, Propósito, Problema, Solución)</w:t>
+              <w:t xml:space="preserve">1–3 (CotoPay, Equipo, Propósito)</w:t>
             </w:r>
           </w:p>
         </w:tc>
@@ -304,7 +288,7 @@
               <w:pStyle w:val="Compact"/>
             </w:pPr>
             <w:r>
-              <w:t xml:space="preserve">~5:35</w:t>
+              <w:t xml:space="preserve">~1:05</w:t>
             </w:r>
           </w:p>
         </w:tc>
@@ -317,7 +301,7 @@
               <w:pStyle w:val="Compact"/>
             </w:pPr>
             <w:r>
-              <w:t xml:space="preserve">Por qué existe esta empresa y qué problema resuelve</w:t>
+              <w:t xml:space="preserve">Quiénes somos y para qué</w:t>
             </w:r>
           </w:p>
         </w:tc>
@@ -334,13 +318,7 @@
                 <w:b/>
                 <w:bCs/>
               </w:rPr>
-              <w:t xml:space="preserve">Bloque B</w:t>
-            </w:r>
-            <w:r>
-              <w:t xml:space="preserve"> </w:t>
-            </w:r>
-            <w:r>
-              <w:t xml:space="preserve">— Presentador 2</w:t>
+              <w:t xml:space="preserve">Bloque 2</w:t>
             </w:r>
           </w:p>
         </w:tc>
@@ -351,7 +329,7 @@
               <w:pStyle w:val="Compact"/>
             </w:pPr>
             <w:r>
-              <w:t xml:space="preserve">6–7 (Producto, Modelo de negocio)</w:t>
+              <w:t xml:space="preserve">4 (Problema)</w:t>
             </w:r>
           </w:p>
         </w:tc>
@@ -362,7 +340,7 @@
               <w:pStyle w:val="Compact"/>
             </w:pPr>
             <w:r>
-              <w:t xml:space="preserve">~3:50</w:t>
+              <w:t xml:space="preserve">~2:30</w:t>
             </w:r>
           </w:p>
         </w:tc>
@@ -373,7 +351,7 @@
               <w:pStyle w:val="Compact"/>
             </w:pPr>
             <w:r>
-              <w:t xml:space="preserve">Cómo funciona y por qué es defendible</w:t>
+              <w:t xml:space="preserve">El problema — la sección que más pesa</w:t>
             </w:r>
           </w:p>
         </w:tc>
@@ -392,13 +370,7 @@
                 <w:b/>
                 <w:bCs/>
               </w:rPr>
-              <w:t xml:space="preserve">Bloque C</w:t>
-            </w:r>
-            <w:r>
-              <w:t xml:space="preserve"> </w:t>
-            </w:r>
-            <w:r>
-              <w:t xml:space="preserve">— Presentador 3</w:t>
+              <w:t xml:space="preserve">Bloque 3</w:t>
             </w:r>
           </w:p>
         </w:tc>
@@ -411,7 +383,7 @@
               <w:pStyle w:val="Compact"/>
             </w:pPr>
             <w:r>
-              <w:t xml:space="preserve">8–12 (Mercado, Por qué ahora, Competencia, Financiero, Cierre)</w:t>
+              <w:t xml:space="preserve">5–6 (Solución, Producto)</w:t>
             </w:r>
           </w:p>
         </w:tc>
@@ -424,7 +396,7 @@
               <w:pStyle w:val="Compact"/>
             </w:pPr>
             <w:r>
-              <w:t xml:space="preserve">~5:15</w:t>
+              <w:t xml:space="preserve">~3:20</w:t>
             </w:r>
           </w:p>
         </w:tc>
@@ -437,7 +409,165 @@
               <w:pStyle w:val="Compact"/>
             </w:pPr>
             <w:r>
-              <w:t xml:space="preserve">Tamaño, timing, plata y cierre</w:t>
+              <w:t xml:space="preserve">Qué construimos y cómo se usa</w:t>
+            </w:r>
+          </w:p>
+        </w:tc>
+      </w:tr>
+      <w:tr>
+        <w:tc>
+          <w:tcPr/>
+          <w:p>
+            <w:pPr>
+              <w:pStyle w:val="Compact"/>
+            </w:pPr>
+            <w:r>
+              <w:rPr>
+                <w:b/>
+                <w:bCs/>
+              </w:rPr>
+              <w:t xml:space="preserve">Bloque 4</w:t>
+            </w:r>
+          </w:p>
+        </w:tc>
+        <w:tc>
+          <w:tcPr/>
+          <w:p>
+            <w:pPr>
+              <w:pStyle w:val="Compact"/>
+            </w:pPr>
+            <w:r>
+              <w:t xml:space="preserve">7 (Modelo de negocio)</w:t>
+            </w:r>
+          </w:p>
+        </w:tc>
+        <w:tc>
+          <w:tcPr/>
+          <w:p>
+            <w:pPr>
+              <w:pStyle w:val="Compact"/>
+            </w:pPr>
+            <w:r>
+              <w:t xml:space="preserve">~2:30</w:t>
+            </w:r>
+          </w:p>
+        </w:tc>
+        <w:tc>
+          <w:tcPr/>
+          <w:p>
+            <w:pPr>
+              <w:pStyle w:val="Compact"/>
+            </w:pPr>
+            <w:r>
+              <w:t xml:space="preserve">Por qué es defendible — la sección escéptica</w:t>
+            </w:r>
+          </w:p>
+        </w:tc>
+      </w:tr>
+      <w:tr>
+        <w:tc>
+          <w:tcPr>
+            <w:shd w:val="clear" w:color="auto" w:fill="F8F8F8"/>
+          </w:tcPr>
+          <w:p>
+            <w:pPr>
+              <w:pStyle w:val="Compact"/>
+            </w:pPr>
+            <w:r>
+              <w:rPr>
+                <w:b/>
+                <w:bCs/>
+              </w:rPr>
+              <w:t xml:space="preserve">Bloque 5</w:t>
+            </w:r>
+          </w:p>
+        </w:tc>
+        <w:tc>
+          <w:tcPr>
+            <w:shd w:val="clear" w:color="auto" w:fill="F8F8F8"/>
+          </w:tcPr>
+          <w:p>
+            <w:pPr>
+              <w:pStyle w:val="Compact"/>
+            </w:pPr>
+            <w:r>
+              <w:t xml:space="preserve">8–10 (Mercado, Por qué ahora, Competencia)</w:t>
+            </w:r>
+          </w:p>
+        </w:tc>
+        <w:tc>
+          <w:tcPr>
+            <w:shd w:val="clear" w:color="auto" w:fill="F8F8F8"/>
+          </w:tcPr>
+          <w:p>
+            <w:pPr>
+              <w:pStyle w:val="Compact"/>
+            </w:pPr>
+            <w:r>
+              <w:t xml:space="preserve">~3:40</w:t>
+            </w:r>
+          </w:p>
+        </w:tc>
+        <w:tc>
+          <w:tcPr>
+            <w:shd w:val="clear" w:color="auto" w:fill="F8F8F8"/>
+          </w:tcPr>
+          <w:p>
+            <w:pPr>
+              <w:pStyle w:val="Compact"/>
+            </w:pPr>
+            <w:r>
+              <w:t xml:space="preserve">Tamaño, timing y posición competitiva</w:t>
+            </w:r>
+          </w:p>
+        </w:tc>
+      </w:tr>
+      <w:tr>
+        <w:tc>
+          <w:tcPr/>
+          <w:p>
+            <w:pPr>
+              <w:pStyle w:val="Compact"/>
+            </w:pPr>
+            <w:r>
+              <w:rPr>
+                <w:b/>
+                <w:bCs/>
+              </w:rPr>
+              <w:t xml:space="preserve">Bloque 6</w:t>
+            </w:r>
+          </w:p>
+        </w:tc>
+        <w:tc>
+          <w:tcPr/>
+          <w:p>
+            <w:pPr>
+              <w:pStyle w:val="Compact"/>
+            </w:pPr>
+            <w:r>
+              <w:t xml:space="preserve">11–12 (Financiero, Cierre)</w:t>
+            </w:r>
+          </w:p>
+        </w:tc>
+        <w:tc>
+          <w:tcPr/>
+          <w:p>
+            <w:pPr>
+              <w:pStyle w:val="Compact"/>
+            </w:pPr>
+            <w:r>
+              <w:t xml:space="preserve">~1:35</w:t>
+            </w:r>
+          </w:p>
+        </w:tc>
+        <w:tc>
+          <w:tcPr/>
+          <w:p>
+            <w:pPr>
+              <w:pStyle w:val="Compact"/>
+            </w:pPr>
+            <w:r>
+              <w:t xml:space="preserve">Plata y cierre</w:t>
             </w:r>
           </w:p>
         </w:tc>
@@ -448,19 +578,19 @@
         <w:pStyle w:val="BodyText"/>
       </w:pPr>
       <w:r>
-        <w:t xml:space="preserve">Si el equipo termina siendo de 2 personas: Bloque A+B para una persona,</w:t>
-      </w:r>
-      <w:r>
-        <w:t xml:space="preserve"> </w:t>
-      </w:r>
-      <w:r>
-        <w:t xml:space="preserve">Bloque C para la otra. Si es individual, el minutado por sección sigue</w:t>
-      </w:r>
-      <w:r>
-        <w:t xml:space="preserve"> </w:t>
-      </w:r>
-      <w:r>
-        <w:t xml:space="preserve">sirviendo igual como guía de ritmo.</w:t>
+        <w:t xml:space="preserve">El bloque 2 (Problema) es el más largo de uno solo — concentra 2:30. Los</w:t>
+      </w:r>
+      <w:r>
+        <w:t xml:space="preserve"> </w:t>
+      </w:r>
+      <w:r>
+        <w:t xml:space="preserve">bloques 1 y 6 son los más cortos; si el orador de apertura y el de cierre</w:t>
+      </w:r>
+      <w:r>
+        <w:t xml:space="preserve"> </w:t>
+      </w:r>
+      <w:r>
+        <w:t xml:space="preserve">son la misma persona, fusionar en un bloque A+F y reasignar.</w:t>
       </w:r>
     </w:p>
     <w:p>
@@ -1330,46 +1460,41 @@
         <w:t xml:space="preserve"> </w:t>
       </w:r>
       <w:r>
-        <w:t xml:space="preserve">“Wallet COTO”</w:t>
-      </w:r>
-      <w:r>
-        <w:t xml:space="preserve"> </w:t>
-      </w:r>
-      <w:r>
-        <w:t xml:space="preserve">— nombre de trabajo. El naming final (¿</w:t>
-      </w:r>
-      <w:r>
-        <w:t xml:space="preserve">“COTO</w:t>
-      </w:r>
-      <w:r>
-        <w:t xml:space="preserve"> </w:t>
-      </w:r>
-      <w:r>
-        <w:t xml:space="preserve">Pay”</w:t>
-      </w:r>
-      <w:r>
-        <w:t xml:space="preserve">, extensión de</w:t>
-      </w:r>
-      <w:r>
-        <w:t xml:space="preserve"> </w:t>
-      </w:r>
-      <w:r>
-        <w:t xml:space="preserve">“Coto Digital”</w:t>
-      </w:r>
-      <w:r>
-        <w:t xml:space="preserve">, u otro?) es una decisión de branding</w:t>
-      </w:r>
-      <w:r>
-        <w:t xml:space="preserve"> </w:t>
-      </w:r>
-      <w:r>
-        <w:t xml:space="preserve">que el equipo todavía no cerró (§1). No hay que sobre-explicar esto: una</w:t>
-      </w:r>
-      <w:r>
-        <w:t xml:space="preserve"> </w:t>
-      </w:r>
-      <w:r>
-        <w:t xml:space="preserve">frase y seguir.</w:t>
+        <w:t xml:space="preserve">“CotoPay”</w:t>
+      </w:r>
+      <w:r>
+        <w:t xml:space="preserve"> </w:t>
+      </w:r>
+      <w:r>
+        <w:t xml:space="preserve">— nombre definitivo de la wallet. El slide de</w:t>
+      </w:r>
+      <w:r>
+        <w:t xml:space="preserve"> </w:t>
+      </w:r>
+      <w:r>
+        <w:t xml:space="preserve">apertura lo muestra grande y tiene un</w:t>
+      </w:r>
+      <w:r>
+        <w:t xml:space="preserve"> </w:t>
+      </w:r>
+      <w:r>
+        <w:rPr>
+          <w:b/>
+          <w:bCs/>
+        </w:rPr>
+        <w:t xml:space="preserve">QR en la esquina inferior derecha</w:t>
+      </w:r>
+      <w:r>
+        <w:t xml:space="preserve"> </w:t>
+      </w:r>
+      <w:r>
+        <w:t xml:space="preserve">que lleva al prototipo en vivo; mencionar brevemente que la audiencia puede</w:t>
+      </w:r>
+      <w:r>
+        <w:t xml:space="preserve"> </w:t>
+      </w:r>
+      <w:r>
+        <w:t xml:space="preserve">escanearlo cuando quiera para verlo en su celular. Una frase y seguir.</w:t>
       </w:r>
     </w:p>
     <w:bookmarkEnd w:id="11"/>
@@ -1391,57 +1516,47 @@
           <w:b/>
           <w:bCs/>
         </w:rPr>
-        <w:t xml:space="preserve">Gap explícito, no resuelto en el documento</w:t>
-      </w:r>
-      <w:r>
-        <w:t xml:space="preserve"> </w:t>
-      </w:r>
-      <w:r>
-        <w:t xml:space="preserve">(§2): completar acá con</w:t>
-      </w:r>
-      <w:r>
-        <w:t xml:space="preserve"> </w:t>
-      </w:r>
-      <w:r>
-        <w:t xml:space="preserve">integrantes reales, background y foto antes de la entrega. El guion deja</w:t>
-      </w:r>
-      <w:r>
-        <w:t xml:space="preserve"> </w:t>
-      </w:r>
-      <w:r>
-        <w:t xml:space="preserve">el espacio pero no inventa nombres. Sugerencia de estructura una vez que</w:t>
-      </w:r>
-      <w:r>
-        <w:t xml:space="preserve"> </w:t>
-      </w:r>
-      <w:r>
-        <w:t xml:space="preserve">haya datos: nombre + 1 línea de por qué esa persona es relevante para</w:t>
-      </w:r>
-      <w:r>
-        <w:t xml:space="preserve"> </w:t>
-      </w:r>
-      <w:r>
-        <w:rPr>
-          <w:i/>
-          <w:iCs/>
-        </w:rPr>
-        <w:t xml:space="preserve">este</w:t>
-      </w:r>
-      <w:r>
-        <w:t xml:space="preserve"> </w:t>
-      </w:r>
-      <w:r>
-        <w:t xml:space="preserve">negocio puntual (retail, pagos, o producto), no un CV genérico.</w:t>
+        <w:t xml:space="preserve">Qué decir</w:t>
+      </w:r>
+      <w:r>
+        <w:t xml:space="preserve"> </w:t>
+      </w:r>
+      <w:r>
+        <w:t xml:space="preserve">(§2): nombrar a los 6 integrantes tal como aparecen en el</w:t>
+      </w:r>
+      <w:r>
+        <w:t xml:space="preserve"> </w:t>
+      </w:r>
+      <w:r>
+        <w:t xml:space="preserve">slide — Mariana Fiorillo, Andres Franco, Diego Pouton, Luciano Suarez,</w:t>
+      </w:r>
+      <w:r>
+        <w:t xml:space="preserve"> </w:t>
+      </w:r>
+      <w:r>
+        <w:t xml:space="preserve">Agustin Trucco, Emma Vignoles. No hay background individual confirmado en</w:t>
+      </w:r>
+      <w:r>
+        <w:t xml:space="preserve"> </w:t>
+      </w:r>
+      <w:r>
+        <w:t xml:space="preserve">el documento para desarrollar en el pitch — una frase por persona como</w:t>
+      </w:r>
+      <w:r>
+        <w:t xml:space="preserve"> </w:t>
+      </w:r>
+      <w:r>
+        <w:t xml:space="preserve">mucho si el tiempo lo permite, sin inventar CVs.</w:t>
       </w:r>
     </w:p>
     <w:bookmarkEnd w:id="12"/>
-    <w:bookmarkStart w:id="13" w:name="propósito-de-la-empresa-025"/>
+    <w:bookmarkStart w:id="13" w:name="propósito-de-comunidad-coto-025"/>
     <w:p>
       <w:pPr>
         <w:pStyle w:val="Heading2"/>
       </w:pPr>
       <w:r>
-        <w:t xml:space="preserve">3. Propósito de la empresa (0:25)</w:t>
+        <w:t xml:space="preserve">3. Propósito de COMUNIDAD COTO (0:25)</w:t>
       </w:r>
     </w:p>
     <w:p>
@@ -1467,25 +1582,19 @@
         <w:pStyle w:val="BlockText"/>
       </w:pPr>
       <w:r>
-        <w:t xml:space="preserve">“Construir la relación directa de pago, datos y fidelización que hoy</w:t>
-      </w:r>
-      <w:r>
-        <w:t xml:space="preserve"> </w:t>
-      </w:r>
-      <w:r>
-        <w:t xml:space="preserve">COTO no tiene con sus propios clientes — porque hoy esa relación la</w:t>
-      </w:r>
-      <w:r>
-        <w:t xml:space="preserve"> </w:t>
-      </w:r>
-      <w:r>
-        <w:t xml:space="preserve">construyen Mercado Pago y MODO, cada vez que un cliente paga digital en</w:t>
-      </w:r>
-      <w:r>
-        <w:t xml:space="preserve"> </w:t>
-      </w:r>
-      <w:r>
-        <w:t xml:space="preserve">una sucursal COTO.”</w:t>
+        <w:t xml:space="preserve">“Aumentar los miembros de la comunidad prestando nuevos servicios,</w:t>
+      </w:r>
+      <w:r>
+        <w:t xml:space="preserve"> </w:t>
+      </w:r>
+      <w:r>
+        <w:t xml:space="preserve">construir una relación directa con los clientes que supere la venta en</w:t>
+      </w:r>
+      <w:r>
+        <w:t xml:space="preserve"> </w:t>
+      </w:r>
+      <w:r>
+        <w:t xml:space="preserve">la góndola.”</w:t>
       </w:r>
     </w:p>
     <w:p>
@@ -1588,19 +1697,7 @@
         <w:t xml:space="preserve"> </w:t>
       </w:r>
       <w:r>
-        <w:t xml:space="preserve">durante 2024. Bajo el</w:t>
-      </w:r>
-      <w:r>
-        <w:t xml:space="preserve"> </w:t>
-      </w:r>
-      <w:r>
-        <w:t xml:space="preserve">marco de la Clase 1 de MT25 (caso Movistar), esto ya es digitalización</w:t>
-      </w:r>
-      <w:r>
-        <w:t xml:space="preserve"> </w:t>
-      </w:r>
-      <w:r>
-        <w:t xml:space="preserve">resuelta — no es lo que falta.</w:t>
+        <w:t xml:space="preserve">durante 2024.</w:t>
       </w:r>
     </w:p>
     <w:p>
@@ -1621,7 +1718,48 @@
         <w:t xml:space="preserve"> </w:t>
       </w:r>
       <w:r>
-        <w:t xml:space="preserve">vía terceros, cuatro puntos (§4.2):</w:t>
+        <w:t xml:space="preserve">vía terceros, cuatro puntos (§4.2). Aplica a dos perfiles de cliente: el</w:t>
+      </w:r>
+      <w:r>
+        <w:t xml:space="preserve"> </w:t>
+      </w:r>
+      <w:r>
+        <w:rPr>
+          <w:b/>
+          <w:bCs/>
+        </w:rPr>
+        <w:t xml:space="preserve">registrado</w:t>
+      </w:r>
+      <w:r>
+        <w:t xml:space="preserve"> </w:t>
+      </w:r>
+      <w:r>
+        <w:t xml:space="preserve">—con Comunidad COTO o Tarjeta TCI activa— y el</w:t>
+      </w:r>
+      <w:r>
+        <w:t xml:space="preserve"> </w:t>
+      </w:r>
+      <w:r>
+        <w:rPr>
+          <w:b/>
+          <w:bCs/>
+        </w:rPr>
+        <w:t xml:space="preserve">casual</w:t>
+      </w:r>
+      <w:r>
+        <w:t xml:space="preserve">,</w:t>
+      </w:r>
+      <w:r>
+        <w:t xml:space="preserve"> </w:t>
+      </w:r>
+      <w:r>
+        <w:t xml:space="preserve">que no dejó ningún dato en el sistema. Ambos son invisibles para MP/MODO</w:t>
+      </w:r>
+      <w:r>
+        <w:t xml:space="preserve"> </w:t>
+      </w:r>
+      <w:r>
+        <w:t xml:space="preserve">en términos de historial de compra de supermercado:</w:t>
       </w:r>
       <w:r>
         <w:t xml:space="preserve"> </w:t>
@@ -1660,13 +1798,19 @@
         <w:t xml:space="preserve">“MODO”</w:t>
       </w:r>
       <w:r>
-        <w:t xml:space="preserve">, no a COTO, aunque el gasto pase en un local COTO.</w:t>
-      </w:r>
-      <w:r>
-        <w:t xml:space="preserve"> </w:t>
-      </w:r>
-      <w:r>
-        <w:t xml:space="preserve">3. Cero control sobre el calendario promocional del propio checkout.</w:t>
+        <w:t xml:space="preserve">, no a COTO, aunque el gasto pase en un local COTO y la</w:t>
+      </w:r>
+      <w:r>
+        <w:t xml:space="preserve"> </w:t>
+      </w:r>
+      <w:r>
+        <w:t xml:space="preserve">promoción le aporta 100% COTO.</w:t>
+      </w:r>
+      <w:r>
+        <w:t xml:space="preserve"> </w:t>
+      </w:r>
+      <w:r>
+        <w:t xml:space="preserve">3. Flexibilidad sobre el calendario promocional del propio checkout.</w:t>
       </w:r>
       <w:r>
         <w:t xml:space="preserve"> </w:t>
@@ -1726,25 +1870,37 @@
           <w:b/>
           <w:bCs/>
         </w:rPr>
-        <w:t xml:space="preserve">Nombrar en voz alta, sin resolver</w:t>
-      </w:r>
-      <w:r>
-        <w:t xml:space="preserve"> </w:t>
-      </w:r>
-      <w:r>
-        <w:t xml:space="preserve">(10s): no hay fuente que confirme</w:t>
-      </w:r>
-      <w:r>
-        <w:t xml:space="preserve"> </w:t>
-      </w:r>
-      <w:r>
-        <w:t xml:space="preserve">quién financia hoy los reintegros de MP/MODO en sucursales COTO — queda</w:t>
-      </w:r>
-      <w:r>
-        <w:t xml:space="preserve"> </w:t>
-      </w:r>
-      <w:r>
-        <w:t xml:space="preserve">abierto para Q&amp;A (retomado en §11 y en la lista de preguntas más abajo).</w:t>
+        <w:t xml:space="preserve">Dato confirmado en workshop, decirlo con seguridad</w:t>
+      </w:r>
+      <w:r>
+        <w:t xml:space="preserve"> </w:t>
+      </w:r>
+      <w:r>
+        <w:t xml:space="preserve">(10s): COTO</w:t>
+      </w:r>
+      <w:r>
+        <w:t xml:space="preserve"> </w:t>
+      </w:r>
+      <w:r>
+        <w:t xml:space="preserve">financia el 100% de las campañas emisoras vía MP/MODO — y al hacerlo,</w:t>
+      </w:r>
+      <w:r>
+        <w:t xml:space="preserve"> </w:t>
+      </w:r>
+      <w:r>
+        <w:t xml:space="preserve">no retiene ningún dato del cliente para uso propio. Ese costo sale del</w:t>
+      </w:r>
+      <w:r>
+        <w:t xml:space="preserve"> </w:t>
+      </w:r>
+      <w:r>
+        <w:t xml:space="preserve">grupo económico cada mes y construye el activo de datos de un tercero,</w:t>
+      </w:r>
+      <w:r>
+        <w:t xml:space="preserve"> </w:t>
+      </w:r>
+      <w:r>
+        <w:t xml:space="preserve">no el de COTO (retomado en §11 y en la lista de preguntas más abajo).</w:t>
       </w:r>
     </w:p>
     <w:bookmarkEnd w:id="14"/>
@@ -1824,49 +1980,94 @@
           <w:b/>
           <w:bCs/>
         </w:rPr>
-        <w:t xml:space="preserve">Los dos diferenciadores que más importan decir</w:t>
-      </w:r>
-      <w:r>
-        <w:t xml:space="preserve"> </w:t>
-      </w:r>
-      <w:r>
-        <w:t xml:space="preserve">(60s, de la tabla</w:t>
-      </w:r>
-      <w:r>
-        <w:t xml:space="preserve"> </w:t>
-      </w:r>
-      <w:r>
-        <w:t xml:space="preserve">completa del §5, priorizando los dos que ningún competidor iguala):</w:t>
-      </w:r>
-      <w:r>
-        <w:t xml:space="preserve"> </w:t>
-      </w:r>
-      <w:r>
-        <w:t xml:space="preserve">- Beneficios personalizados según historial real de compra (categoría,</w:t>
-      </w:r>
-      <w:r>
-        <w:t xml:space="preserve"> </w:t>
-      </w:r>
-      <w:r>
-        <w:t xml:space="preserve">frecuencia, ticket) — no un % genérico por rubro como Cuenta DNI, ni</w:t>
-      </w:r>
-      <w:r>
-        <w:t xml:space="preserve"> </w:t>
-      </w:r>
-      <w:r>
-        <w:t xml:space="preserve">dependiente de Meli+ como MP.</w:t>
-      </w:r>
-      <w:r>
-        <w:t xml:space="preserve"> </w:t>
-      </w:r>
-      <w:r>
-        <w:t xml:space="preserve">- La fidelización vive dentro del mismo instrumento de pago, sin tarjeta</w:t>
-      </w:r>
-      <w:r>
-        <w:t xml:space="preserve"> </w:t>
-      </w:r>
-      <w:r>
-        <w:t xml:space="preserve">aparte — ningún competidor integra</w:t>
+        <w:t xml:space="preserve">Los tres pilares en orden, decirlos explícito</w:t>
+      </w:r>
+      <w:r>
+        <w:t xml:space="preserve"> </w:t>
+      </w:r>
+      <w:r>
+        <w:t xml:space="preserve">(60s):</w:t>
+      </w:r>
+      <w:r>
+        <w:t xml:space="preserve"> </w:t>
+      </w:r>
+      <w:r>
+        <w:t xml:space="preserve">1.</w:t>
+      </w:r>
+      <w:r>
+        <w:t xml:space="preserve"> </w:t>
+      </w:r>
+      <w:r>
+        <w:rPr>
+          <w:b/>
+          <w:bCs/>
+        </w:rPr>
+        <w:t xml:space="preserve">Fidelización</w:t>
+      </w:r>
+      <w:r>
+        <w:t xml:space="preserve">: CotoPay construye la relación directa y continua de</w:t>
+      </w:r>
+      <w:r>
+        <w:t xml:space="preserve"> </w:t>
+      </w:r>
+      <w:r>
+        <w:t xml:space="preserve">COTO con su cliente — sin depender de que un tercero la intermedie.</w:t>
+      </w:r>
+      <w:r>
+        <w:t xml:space="preserve"> </w:t>
+      </w:r>
+      <w:r>
+        <w:t xml:space="preserve">2.</w:t>
+      </w:r>
+      <w:r>
+        <w:t xml:space="preserve"> </w:t>
+      </w:r>
+      <w:r>
+        <w:rPr>
+          <w:b/>
+          <w:bCs/>
+        </w:rPr>
+        <w:t xml:space="preserve">Beneficios personalizados</w:t>
+      </w:r>
+      <w:r>
+        <w:t xml:space="preserve">: según historial real de compra</w:t>
+      </w:r>
+      <w:r>
+        <w:t xml:space="preserve"> </w:t>
+      </w:r>
+      <w:r>
+        <w:t xml:space="preserve">(categoría, frecuencia, ticket) — no un % genérico por rubro como</w:t>
+      </w:r>
+      <w:r>
+        <w:t xml:space="preserve"> </w:t>
+      </w:r>
+      <w:r>
+        <w:t xml:space="preserve">Cuenta DNI, ni dependiente de Meli+ como MP.</w:t>
+      </w:r>
+      <w:r>
+        <w:t xml:space="preserve"> </w:t>
+      </w:r>
+      <w:r>
+        <w:t xml:space="preserve">3.</w:t>
+      </w:r>
+      <w:r>
+        <w:t xml:space="preserve"> </w:t>
+      </w:r>
+      <w:r>
+        <w:rPr>
+          <w:b/>
+          <w:bCs/>
+        </w:rPr>
+        <w:t xml:space="preserve">Medio de pago embebido</w:t>
+      </w:r>
+      <w:r>
+        <w:t xml:space="preserve">: la fidelización vive dentro del mismo</w:t>
+      </w:r>
+      <w:r>
+        <w:t xml:space="preserve"> </w:t>
+      </w:r>
+      <w:r>
+        <w:t xml:space="preserve">instrumento de pago, sin tarjeta aparte — ningún competidor integra</w:t>
       </w:r>
       <w:r>
         <w:t xml:space="preserve"> </w:t>
@@ -1890,13 +2091,7 @@
         <w:t xml:space="preserve"> </w:t>
       </w:r>
       <w:r>
-        <w:t xml:space="preserve">en el mismo</w:t>
-      </w:r>
-      <w:r>
-        <w:t xml:space="preserve"> </w:t>
-      </w:r>
-      <w:r>
-        <w:t xml:space="preserve">QR con reglas fijas y visibles.</w:t>
+        <w:t xml:space="preserve">en el mismo QR con reglas fijas y visibles.</w:t>
       </w:r>
     </w:p>
     <w:p>
@@ -2024,7 +2219,32 @@
         <w:t xml:space="preserve"> </w:t>
       </w:r>
       <w:r>
-        <w:t xml:space="preserve">integrada con Coto Digital.</w:t>
+        <w:t xml:space="preserve">integrada con Coto Digital. La capacidad diferencial que habilita todo</w:t>
+      </w:r>
+      <w:r>
+        <w:t xml:space="preserve"> </w:t>
+      </w:r>
+      <w:r>
+        <w:t xml:space="preserve">esto:</w:t>
+      </w:r>
+      <w:r>
+        <w:t xml:space="preserve"> </w:t>
+      </w:r>
+      <w:r>
+        <w:rPr>
+          <w:b/>
+          <w:bCs/>
+        </w:rPr>
+        <w:t xml:space="preserve">procesamiento de tarjetas propio</w:t>
+      </w:r>
+      <w:r>
+        <w:t xml:space="preserve">, que mantiene el dato de cada</w:t>
+      </w:r>
+      <w:r>
+        <w:t xml:space="preserve"> </w:t>
+      </w:r>
+      <w:r>
+        <w:t xml:space="preserve">transacción dentro del ecosistema COTO sin pasarlo por un riel externo.</w:t>
       </w:r>
     </w:p>
     <w:p>
@@ -2985,7 +3205,69 @@
         <w:t xml:space="preserve"> </w:t>
       </w:r>
       <w:r>
-        <w:t xml:space="preserve">exista todavía una wallet propia de COTO.</w:t>
+        <w:t xml:space="preserve">exista todavía una wallet propia de COTO. Las curvas de adopción QR</w:t>
+      </w:r>
+      <w:r>
+        <w:t xml:space="preserve"> </w:t>
+      </w:r>
+      <w:r>
+        <w:t xml:space="preserve">proyectan 35–40% para 2026 — el tiempo de actuar es ahora, no en dos</w:t>
+      </w:r>
+      <w:r>
+        <w:t xml:space="preserve"> </w:t>
+      </w:r>
+      <w:r>
+        <w:t xml:space="preserve">años.</w:t>
+      </w:r>
+      <w:r>
+        <w:t xml:space="preserve"> </w:t>
+      </w:r>
+      <w:r>
+        <w:t xml:space="preserve">- Dos referentes de finanzas embebidas en ecosistemas propios validan el</w:t>
+      </w:r>
+      <w:r>
+        <w:t xml:space="preserve"> </w:t>
+      </w:r>
+      <w:r>
+        <w:t xml:space="preserve">modelo:</w:t>
+      </w:r>
+      <w:r>
+        <w:t xml:space="preserve"> </w:t>
+      </w:r>
+      <w:r>
+        <w:rPr>
+          <w:b/>
+          <w:bCs/>
+        </w:rPr>
+        <w:t xml:space="preserve">Shellbox (YPF)</w:t>
+      </w:r>
+      <w:r>
+        <w:t xml:space="preserve"> </w:t>
+      </w:r>
+      <w:r>
+        <w:t xml:space="preserve">y</w:t>
+      </w:r>
+      <w:r>
+        <w:t xml:space="preserve"> </w:t>
+      </w:r>
+      <w:r>
+        <w:rPr>
+          <w:b/>
+          <w:bCs/>
+        </w:rPr>
+        <w:t xml:space="preserve">FarmaPay</w:t>
+      </w:r>
+      <w:r>
+        <w:t xml:space="preserve"> </w:t>
+      </w:r>
+      <w:r>
+        <w:t xml:space="preserve">— la analogía directa con lo</w:t>
+      </w:r>
+      <w:r>
+        <w:t xml:space="preserve"> </w:t>
+      </w:r>
+      <w:r>
+        <w:t xml:space="preserve">que sería CotoPay para la red COTO.</w:t>
       </w:r>
     </w:p>
     <w:p>
@@ -3287,19 +3569,13 @@
           <w:b/>
           <w:bCs/>
         </w:rPr>
-        <w:t xml:space="preserve">USD 900.000</w:t>
-      </w:r>
-      <w:r>
-        <w:t xml:space="preserve"> </w:t>
-      </w:r>
-      <w:r>
-        <w:t xml:space="preserve">(punto medio del rango</w:t>
-      </w:r>
-      <w:r>
-        <w:t xml:space="preserve"> </w:t>
-      </w:r>
-      <w:r>
-        <w:t xml:space="preserve">650K-1,15M original, sin sesgo direccional) — plataforma vía partnership</w:t>
+        <w:t xml:space="preserve">USD 500.000</w:t>
+      </w:r>
+      <w:r>
+        <w:t xml:space="preserve"> </w:t>
+      </w:r>
+      <w:r>
+        <w:t xml:space="preserve">— plataforma vía partnership</w:t>
       </w:r>
       <w:r>
         <w:t xml:space="preserve"> </w:t>
@@ -3317,13 +3593,7 @@
         <w:t xml:space="preserve"> </w:t>
       </w:r>
       <w:r>
-        <w:t xml:space="preserve">todavía — sigue siendo un supuesto de trabajo, ahora puntual en vez de</w:t>
-      </w:r>
-      <w:r>
-        <w:t xml:space="preserve"> </w:t>
-      </w:r>
-      <w:r>
-        <w:t xml:space="preserve">rango.</w:t>
+        <w:t xml:space="preserve">todavía — es un supuesto de trabajo aprobado en workshop.</w:t>
       </w:r>
       <w:r>
         <w:t xml:space="preserve"> </w:t>
@@ -3341,19 +3611,25 @@
         <w:t xml:space="preserve"> </w:t>
       </w:r>
       <w:r>
-        <w:t xml:space="preserve">objetivo de cada fase, por analogía de orden de magnitud con los</w:t>
-      </w:r>
-      <w:r>
-        <w:t xml:space="preserve"> </w:t>
-      </w:r>
-      <w:r>
-        <w:t xml:space="preserve">reintegros de la competencia (10-25% MP, 20-30% MODO) — no un benchmark</w:t>
-      </w:r>
-      <w:r>
-        <w:t xml:space="preserve"> </w:t>
-      </w:r>
-      <w:r>
-        <w:t xml:space="preserve">propio (§11.2).</w:t>
+        <w:t xml:space="preserve">objetivo de cada fase. Desde la Fase 2, se suman USD 100.000</w:t>
+      </w:r>
+      <w:r>
+        <w:t xml:space="preserve"> </w:t>
+      </w:r>
+      <w:r>
+        <w:t xml:space="preserve">adicionales de escala. Palanca de financiamiento parcial: un 20% de</w:t>
+      </w:r>
+      <w:r>
+        <w:t xml:space="preserve"> </w:t>
+      </w:r>
+      <w:r>
+        <w:t xml:space="preserve">conversión de clientes de MP a CotoPay genera ahorro de comisiones que</w:t>
+      </w:r>
+      <w:r>
+        <w:t xml:space="preserve"> </w:t>
+      </w:r>
+      <w:r>
+        <w:t xml:space="preserve">fondea parcialmente el OPEX de la siguiente fase (§11.2).</w:t>
       </w:r>
       <w:r>
         <w:t xml:space="preserve"> </w:t>
@@ -3469,31 +3745,77 @@
         <w:t xml:space="preserve"> </w:t>
       </w:r>
       <w:r>
-        <w:t xml:space="preserve">descartaría de inmediato. Se presenta el número puntual junto con la</w:t>
-      </w:r>
-      <w:r>
-        <w:t xml:space="preserve"> </w:t>
-      </w:r>
-      <w:r>
-        <w:t xml:space="preserve">lógica de por qué es conservador, citando el Anexo de supuestos. El</w:t>
-      </w:r>
-      <w:r>
-        <w:t xml:space="preserve"> </w:t>
-      </w:r>
-      <w:r>
-        <w:t xml:space="preserve">riesgo financiero principal a nombrar en voz alta: la fracción de GMV</w:t>
-      </w:r>
-      <w:r>
-        <w:t xml:space="preserve"> </w:t>
-      </w:r>
-      <w:r>
-        <w:t xml:space="preserve">genuinamente incremental sigue siendo el supuesto menos sólido de todo el</w:t>
-      </w:r>
-      <w:r>
-        <w:t xml:space="preserve"> </w:t>
-      </w:r>
-      <w:r>
-        <w:t xml:space="preserve">modelo — pesa más que el riesgo tecnológico o de costo de plataforma.</w:t>
+        <w:t xml:space="preserve">descartaría de inmediato. El horizonte del modelo financiero es</w:t>
+      </w:r>
+      <w:r>
+        <w:t xml:space="preserve"> </w:t>
+      </w:r>
+      <w:r>
+        <w:rPr>
+          <w:b/>
+          <w:bCs/>
+        </w:rPr>
+        <w:t xml:space="preserve">24</w:t>
+      </w:r>
+      <w:r>
+        <w:rPr>
+          <w:b/>
+          <w:bCs/>
+        </w:rPr>
+        <w:t xml:space="preserve"> </w:t>
+      </w:r>
+      <w:r>
+        <w:rPr>
+          <w:b/>
+          <w:bCs/>
+        </w:rPr>
+        <w:t xml:space="preserve">meses</w:t>
+      </w:r>
+      <w:r>
+        <w:t xml:space="preserve">; el VAN puntual está</w:t>
+      </w:r>
+      <w:r>
+        <w:t xml:space="preserve"> </w:t>
+      </w:r>
+      <w:r>
+        <w:rPr>
+          <w:b/>
+          <w:bCs/>
+        </w:rPr>
+        <w:t xml:space="preserve">a definir con modelo actualizado</w:t>
+      </w:r>
+      <w:r>
+        <w:t xml:space="preserve">. Se</w:t>
+      </w:r>
+      <w:r>
+        <w:t xml:space="preserve"> </w:t>
+      </w:r>
+      <w:r>
+        <w:t xml:space="preserve">presenta la lógica de por qué es conservador, citando el Anexo de</w:t>
+      </w:r>
+      <w:r>
+        <w:t xml:space="preserve"> </w:t>
+      </w:r>
+      <w:r>
+        <w:t xml:space="preserve">supuestos. El riesgo financiero principal a nombrar en voz alta: la</w:t>
+      </w:r>
+      <w:r>
+        <w:t xml:space="preserve"> </w:t>
+      </w:r>
+      <w:r>
+        <w:t xml:space="preserve">fracción de GMV genuinamente incremental sigue siendo el supuesto menos</w:t>
+      </w:r>
+      <w:r>
+        <w:t xml:space="preserve"> </w:t>
+      </w:r>
+      <w:r>
+        <w:t xml:space="preserve">sólido de todo el modelo — pesa más que el riesgo tecnológico o de costo</w:t>
+      </w:r>
+      <w:r>
+        <w:t xml:space="preserve"> </w:t>
+      </w:r>
+      <w:r>
+        <w:t xml:space="preserve">de plataforma.</w:t>
       </w:r>
     </w:p>
     <w:bookmarkEnd w:id="21"/>
@@ -3591,7 +3913,7 @@
     </w:p>
     <w:bookmarkEnd w:id="22"/>
     <w:bookmarkEnd w:id="23"/>
-    <w:bookmarkStart w:id="27" w:name="preparación-para-los-10-minutos-de-qa"/>
+    <w:bookmarkStart w:id="29" w:name="preparación-para-los-10-minutos-de-qa"/>
     <w:p>
       <w:pPr>
         <w:pStyle w:val="Heading1"/>
@@ -3686,61 +4008,37 @@
         <w:t xml:space="preserve"> </w:t>
       </w:r>
       <w:r>
-        <w:t xml:space="preserve">“No tenemos ese dato confirmado con COTO, y lo decimos</w:t>
-      </w:r>
-      <w:r>
-        <w:t xml:space="preserve"> </w:t>
-      </w:r>
-      <w:r>
-        <w:t xml:space="preserve">&gt; así en el documento. Adoptamos una posición de trabajo: COTO cofinancia</w:t>
-      </w:r>
-      <w:r>
-        <w:t xml:space="preserve"> </w:t>
-      </w:r>
-      <w:r>
-        <w:t xml:space="preserve">&gt; aproximadamente el 60% del costo de esos reintegros, sobre una tasa</w:t>
-      </w:r>
-      <w:r>
-        <w:t xml:space="preserve"> </w:t>
-      </w:r>
-      <w:r>
-        <w:t xml:space="preserve">&gt; combinada de reintegro del 20% — es el supuesto con menos respaldo de</w:t>
-      </w:r>
-      <w:r>
-        <w:t xml:space="preserve"> </w:t>
-      </w:r>
-      <w:r>
-        <w:t xml:space="preserve">&gt; los cinco que documentamos en el Anexo, ni siquiera tiene un anclaje</w:t>
-      </w:r>
-      <w:r>
-        <w:t xml:space="preserve"> </w:t>
-      </w:r>
-      <w:r>
-        <w:t xml:space="preserve">&gt; indirecto fuerte. Con esa cifra de trabajo, redirigir ese presupuesto a</w:t>
-      </w:r>
-      <w:r>
-        <w:t xml:space="preserve"> </w:t>
-      </w:r>
-      <w:r>
-        <w:t xml:space="preserve">&gt; la wallet propia representaría un ahorro potencial de 12% del GMV</w:t>
-      </w:r>
-      <w:r>
-        <w:t xml:space="preserve"> </w:t>
-      </w:r>
-      <w:r>
-        <w:t xml:space="preserve">&gt; migrado cada año — pero si COTO confirma que financia 0%, esa línea</w:t>
-      </w:r>
-      <w:r>
-        <w:t xml:space="preserve"> </w:t>
-      </w:r>
-      <w:r>
-        <w:t xml:space="preserve">&gt; desaparece completa del caso financiero. Es la primera pregunta que le</w:t>
-      </w:r>
-      <w:r>
-        <w:t xml:space="preserve"> </w:t>
-      </w:r>
-      <w:r>
-        <w:t xml:space="preserve">&gt; haríamos a COTO si arrancamos el piloto.”</w:t>
+        <w:t xml:space="preserve">“Ese punto está confirmado: COTO financia el 100% de</w:t>
+      </w:r>
+      <w:r>
+        <w:t xml:space="preserve"> </w:t>
+      </w:r>
+      <w:r>
+        <w:t xml:space="preserve">&gt; las campañas emisoras vía MP/MODO. El costo sale íntegro del grupo</w:t>
+      </w:r>
+      <w:r>
+        <w:t xml:space="preserve"> </w:t>
+      </w:r>
+      <w:r>
+        <w:t xml:space="preserve">&gt; económico cada mes sin que COTO retenga ningún dato del cliente para</w:t>
+      </w:r>
+      <w:r>
+        <w:t xml:space="preserve"> </w:t>
+      </w:r>
+      <w:r>
+        <w:t xml:space="preserve">&gt; uso propio. Redirigir ese presupuesto a la wallet propia es una fuente</w:t>
+      </w:r>
+      <w:r>
+        <w:t xml:space="preserve"> </w:t>
+      </w:r>
+      <w:r>
+        <w:t xml:space="preserve">&gt; de ahorro directa que fondea parcialmente el OPEX del proyecto — ese</w:t>
+      </w:r>
+      <w:r>
+        <w:t xml:space="preserve"> </w:t>
+      </w:r>
+      <w:r>
+        <w:t xml:space="preserve">&gt; argumento ya no es un supuesto, es un insumo confirmado del modelo.”</w:t>
       </w:r>
     </w:p>
     <w:p>
@@ -4102,55 +4400,43 @@
         <w:t xml:space="preserve"> </w:t>
       </w:r>
       <w:r>
-        <w:t xml:space="preserve">&gt; Para poder avanzar fijamos un punto de trabajo de USD 900.000 de CAPEX</w:t>
-      </w:r>
-      <w:r>
-        <w:t xml:space="preserve"> </w:t>
-      </w:r>
-      <w:r>
-        <w:t xml:space="preserve">&gt; inicial — el punto medio de cada componente del rango de orden de</w:t>
-      </w:r>
-      <w:r>
-        <w:t xml:space="preserve"> </w:t>
-      </w:r>
-      <w:r>
-        <w:t xml:space="preserve">&gt; magnitud que manejábamos antes (650k-1.15M), sin sesgo hacia arriba o</w:t>
-      </w:r>
-      <w:r>
-        <w:t xml:space="preserve"> </w:t>
-      </w:r>
-      <w:r>
-        <w:t xml:space="preserve">&gt; abajo porque no hay una razón de negocio para inclinarnos a ningún</w:t>
-      </w:r>
-      <w:r>
-        <w:t xml:space="preserve"> </w:t>
-      </w:r>
-      <w:r>
-        <w:t xml:space="preserve">&gt; extremo, a diferencia de otros supuestos del modelo. La decisión de ir</w:t>
-      </w:r>
-      <w:r>
-        <w:t xml:space="preserve"> </w:t>
-      </w:r>
-      <w:r>
-        <w:t xml:space="preserve">&gt; por partnership en vez de licencia bancaria propia (como Ualá) es la que</w:t>
-      </w:r>
-      <w:r>
-        <w:t xml:space="preserve"> </w:t>
-      </w:r>
-      <w:r>
-        <w:t xml:space="preserve">&gt; mantiene ese costo en ese orden de magnitud; elegir proveedor y cerrar</w:t>
-      </w:r>
-      <w:r>
-        <w:t xml:space="preserve"> </w:t>
-      </w:r>
-      <w:r>
-        <w:t xml:space="preserve">&gt; el costo real de procesamiento por transacción es de los primeros pasos</w:t>
-      </w:r>
-      <w:r>
-        <w:t xml:space="preserve"> </w:t>
-      </w:r>
-      <w:r>
-        <w:t xml:space="preserve">&gt; ejecutivos post-aprobación, no algo que se resuelve en este pitch.”</w:t>
+        <w:t xml:space="preserve">&gt; El CAPEX de referencia es USD 500.000 — supuesto aprobado en workshop,</w:t>
+      </w:r>
+      <w:r>
+        <w:t xml:space="preserve"> </w:t>
+      </w:r>
+      <w:r>
+        <w:t xml:space="preserve">&gt; validado como orden de magnitud para una plataforma vía partnership</w:t>
+      </w:r>
+      <w:r>
+        <w:t xml:space="preserve"> </w:t>
+      </w:r>
+      <w:r>
+        <w:t xml:space="preserve">&gt; PSP/BaaS, sin construir infraestructura bancaria propia como Ualá. La</w:t>
+      </w:r>
+      <w:r>
+        <w:t xml:space="preserve"> </w:t>
+      </w:r>
+      <w:r>
+        <w:t xml:space="preserve">&gt; decisión de ir por partnership es la que mantiene ese costo en ese</w:t>
+      </w:r>
+      <w:r>
+        <w:t xml:space="preserve"> </w:t>
+      </w:r>
+      <w:r>
+        <w:t xml:space="preserve">&gt; orden; elegir proveedor y cerrar el costo real de procesamiento por</w:t>
+      </w:r>
+      <w:r>
+        <w:t xml:space="preserve"> </w:t>
+      </w:r>
+      <w:r>
+        <w:t xml:space="preserve">&gt; transacción es de los primeros pasos ejecutivos post-aprobación, no</w:t>
+      </w:r>
+      <w:r>
+        <w:t xml:space="preserve"> </w:t>
+      </w:r>
+      <w:r>
+        <w:t xml:space="preserve">&gt; algo que se resuelve en este pitch.”</w:t>
       </w:r>
     </w:p>
     <w:bookmarkEnd w:id="24"/>
@@ -4488,8 +4774,576 @@
         </w:pict>
       </w:r>
     </w:p>
+    <w:p>
+      <w:r>
+        <w:pict>
+          <v:rect style="width:0;height:1.5pt" o:hralign="center" o:hrstd="t" o:hr="t"/>
+        </w:pict>
+      </w:r>
+    </w:p>
     <w:bookmarkEnd w:id="25"/>
-    <w:bookmarkStart w:id="26" w:name="notas-de-uso-de-este-guion"/>
+    <w:bookmarkStart w:id="26" w:name="evolutivos-del-producto-visión-de-escala"/>
+    <w:p>
+      <w:pPr>
+        <w:pStyle w:val="Heading2"/>
+      </w:pPr>
+      <w:r>
+        <w:t xml:space="preserve">Evolutivos del producto — visión de escala</w:t>
+      </w:r>
+    </w:p>
+    <w:p>
+      <w:pPr>
+        <w:pStyle w:val="FirstParagraph"/>
+      </w:pPr>
+      <w:r>
+        <w:t xml:space="preserve">Antes de la frase de cierre, 30 segundos de visión estratégica a mediano</w:t>
+      </w:r>
+      <w:r>
+        <w:t xml:space="preserve"> </w:t>
+      </w:r>
+      <w:r>
+        <w:t xml:space="preserve">plazo — se dice rápido, como horizonte que muestra profundidad del negocio</w:t>
+      </w:r>
+      <w:r>
+        <w:t xml:space="preserve"> </w:t>
+      </w:r>
+      <w:r>
+        <w:t xml:space="preserve">sin comprometer el scope del piloto. No son parte del plan financiero de</w:t>
+      </w:r>
+      <w:r>
+        <w:t xml:space="preserve"> </w:t>
+      </w:r>
+      <w:r>
+        <w:t xml:space="preserve">lanzamiento: son la razón de fondo por la que el dato que se genera hoy</w:t>
+      </w:r>
+      <w:r>
+        <w:t xml:space="preserve"> </w:t>
+      </w:r>
+      <w:r>
+        <w:t xml:space="preserve">vale más allá de la comisión que se ahorra. Corre sobre el buffer de 20</w:t>
+      </w:r>
+      <w:r>
+        <w:t xml:space="preserve"> </w:t>
+      </w:r>
+      <w:r>
+        <w:t xml:space="preserve">segundos del minutado; si hace falta, comprimir a una sola frase ancla.</w:t>
+      </w:r>
+    </w:p>
+    <w:p>
+      <w:pPr>
+        <w:pStyle w:val="BodyText"/>
+      </w:pPr>
+      <w:r>
+        <w:t xml:space="preserve">Guion hablado (casi textual):</w:t>
+      </w:r>
+    </w:p>
+    <w:p>
+      <w:pPr>
+        <w:pStyle w:val="BlockText"/>
+      </w:pPr>
+      <w:r>
+        <w:t xml:space="preserve">“Una vez que el flywheel de datos esté girando — y eso es lo que</w:t>
+      </w:r>
+      <w:r>
+        <w:t xml:space="preserve"> </w:t>
+      </w:r>
+      <w:r>
+        <w:t xml:space="preserve">construimos en las tres fases — dos evolutivos naturales se habilitan:</w:t>
+      </w:r>
+      <w:r>
+        <w:t xml:space="preserve"> </w:t>
+      </w:r>
+      <w:r>
+        <w:t xml:space="preserve">primero,</w:t>
+      </w:r>
+      <w:r>
+        <w:t xml:space="preserve"> </w:t>
+      </w:r>
+      <w:r>
+        <w:rPr>
+          <w:b/>
+          <w:bCs/>
+        </w:rPr>
+        <w:t xml:space="preserve">micropréstamos para consumo dentro de COTO</w:t>
+      </w:r>
+      <w:r>
+        <w:t xml:space="preserve">, instrumentados a</w:t>
+      </w:r>
+      <w:r>
+        <w:t xml:space="preserve"> </w:t>
+      </w:r>
+      <w:r>
+        <w:t xml:space="preserve">través de TCI, la unidad financiera del holding que ya existe. El historial</w:t>
+      </w:r>
+      <w:r>
+        <w:t xml:space="preserve"> </w:t>
+      </w:r>
+      <w:r>
+        <w:t xml:space="preserve">de compra real de CotoPay es una señal crediticia mejor que cualquier score</w:t>
+      </w:r>
+      <w:r>
+        <w:t xml:space="preserve"> </w:t>
+      </w:r>
+      <w:r>
+        <w:t xml:space="preserve">bancario para predecir si este cliente va a repagar un préstamo de consumo</w:t>
+      </w:r>
+      <w:r>
+        <w:t xml:space="preserve"> </w:t>
+      </w:r>
+      <w:r>
+        <w:t xml:space="preserve">en el mismo supermercado donde lo originó. Segundo,</w:t>
+      </w:r>
+      <w:r>
+        <w:t xml:space="preserve"> </w:t>
+      </w:r>
+      <w:r>
+        <w:rPr>
+          <w:b/>
+          <w:bCs/>
+        </w:rPr>
+        <w:t xml:space="preserve">hiperpersonalización</w:t>
+      </w:r>
+      <w:r>
+        <w:rPr>
+          <w:b/>
+          <w:bCs/>
+        </w:rPr>
+        <w:t xml:space="preserve"> </w:t>
+      </w:r>
+      <w:r>
+        <w:rPr>
+          <w:b/>
+          <w:bCs/>
+        </w:rPr>
+        <w:t xml:space="preserve">de la oferta a nivel de ítem</w:t>
+      </w:r>
+      <w:r>
+        <w:t xml:space="preserve">: pasar de segmentar por RFM a modelos que</w:t>
+      </w:r>
+      <w:r>
+        <w:t xml:space="preserve"> </w:t>
+      </w:r>
+      <w:r>
+        <w:t xml:space="preserve">saben exactamente qué descuento acepta este cliente, en esta categoría, en</w:t>
+      </w:r>
+      <w:r>
+        <w:t xml:space="preserve"> </w:t>
+      </w:r>
+      <w:r>
+        <w:t xml:space="preserve">esta visita — y vender esa capacidad de targeting a las marcas proveedoras</w:t>
+      </w:r>
+      <w:r>
+        <w:t xml:space="preserve"> </w:t>
+      </w:r>
+      <w:r>
+        <w:t xml:space="preserve">como retail media de alta precisión. Estos dos evolutivos no son el scope</w:t>
+      </w:r>
+      <w:r>
+        <w:t xml:space="preserve"> </w:t>
+      </w:r>
+      <w:r>
+        <w:t xml:space="preserve">del piloto, pero son la razón por la que el dato que generamos hoy vale</w:t>
+      </w:r>
+      <w:r>
+        <w:t xml:space="preserve"> </w:t>
+      </w:r>
+      <w:r>
+        <w:t xml:space="preserve">mucho más que la comisión que ahorramos.”</w:t>
+      </w:r>
+    </w:p>
+    <w:p>
+      <w:pPr>
+        <w:pStyle w:val="FirstParagraph"/>
+      </w:pPr>
+      <w:r>
+        <w:rPr>
+          <w:b/>
+          <w:bCs/>
+        </w:rPr>
+        <w:t xml:space="preserve">Qué no decir</w:t>
+      </w:r>
+      <w:r>
+        <w:t xml:space="preserve">: cifras de retorno o proyecciones de estos evolutivos —</w:t>
+      </w:r>
+      <w:r>
+        <w:t xml:space="preserve"> </w:t>
+      </w:r>
+      <w:r>
+        <w:t xml:space="preserve">no hay números validados. Se presenta como visión estratégica fundamentada</w:t>
+      </w:r>
+      <w:r>
+        <w:t xml:space="preserve"> </w:t>
+      </w:r>
+      <w:r>
+        <w:t xml:space="preserve">en la lógica del negocio, no como plan.</w:t>
+      </w:r>
+    </w:p>
+    <w:p>
+      <w:pPr>
+        <w:pStyle w:val="BodyText"/>
+      </w:pPr>
+      <w:r>
+        <w:rPr>
+          <w:b/>
+          <w:bCs/>
+        </w:rPr>
+        <w:t xml:space="preserve">Nota de contenido</w:t>
+      </w:r>
+      <w:r>
+        <w:t xml:space="preserve"> </w:t>
+      </w:r>
+      <w:r>
+        <w:t xml:space="preserve">(para quien lo dice y para preguntas de Q&amp;A):</w:t>
+      </w:r>
+      <w:r>
+        <w:t xml:space="preserve"> </w:t>
+      </w:r>
+      <w:r>
+        <w:t xml:space="preserve">-</w:t>
+      </w:r>
+      <w:r>
+        <w:t xml:space="preserve"> </w:t>
+      </w:r>
+      <w:r>
+        <w:rPr>
+          <w:b/>
+          <w:bCs/>
+        </w:rPr>
+        <w:t xml:space="preserve">Micropréstamos vía TCI</w:t>
+      </w:r>
+      <w:r>
+        <w:t xml:space="preserve">: TCI ya existe dentro del holding — no requiere</w:t>
+      </w:r>
+      <w:r>
+        <w:t xml:space="preserve"> </w:t>
+      </w:r>
+      <w:r>
+        <w:t xml:space="preserve">licencia bancaria nueva. El dato de compra real de CotoPay es mejor señal</w:t>
+      </w:r>
+      <w:r>
+        <w:t xml:space="preserve"> </w:t>
+      </w:r>
+      <w:r>
+        <w:t xml:space="preserve">crediticia para consumo en supermercados que el score de un banco que solo</w:t>
+      </w:r>
+      <w:r>
+        <w:t xml:space="preserve"> </w:t>
+      </w:r>
+      <w:r>
+        <w:t xml:space="preserve">ve el movimiento de dinero. El crédito es captive (solo para consumo dentro</w:t>
+      </w:r>
+      <w:r>
+        <w:t xml:space="preserve"> </w:t>
+      </w:r>
+      <w:r>
+        <w:t xml:space="preserve">de COTO): reduce riesgo de incobrabilidad y aumenta el ticket. Regulación:</w:t>
+      </w:r>
+      <w:r>
+        <w:t xml:space="preserve"> </w:t>
+      </w:r>
+      <w:r>
+        <w:t xml:space="preserve">TCI ya opera en ese marco; escalar el volumen de originaciones requiere</w:t>
+      </w:r>
+      <w:r>
+        <w:t xml:space="preserve"> </w:t>
+      </w:r>
+      <w:r>
+        <w:t xml:space="preserve">capacidad que se construye con datos de CotoPay, no antes.</w:t>
+      </w:r>
+      <w:r>
+        <w:t xml:space="preserve"> </w:t>
+      </w:r>
+      <w:r>
+        <w:t xml:space="preserve">-</w:t>
+      </w:r>
+      <w:r>
+        <w:t xml:space="preserve"> </w:t>
+      </w:r>
+      <w:r>
+        <w:rPr>
+          <w:b/>
+          <w:bCs/>
+        </w:rPr>
+        <w:t xml:space="preserve">Hiperpersonalización</w:t>
+      </w:r>
+      <w:r>
+        <w:t xml:space="preserve">: el dato de compra ítem a ítem es el activo que</w:t>
+      </w:r>
+      <w:r>
+        <w:t xml:space="preserve"> </w:t>
+      </w:r>
+      <w:r>
+        <w:t xml:space="preserve">ningún competidor de pagos (MP, MODO, Ualá) puede tener — solo COTO lo</w:t>
+      </w:r>
+      <w:r>
+        <w:t xml:space="preserve"> </w:t>
+      </w:r>
+      <w:r>
+        <w:t xml:space="preserve">genera. Conecta con la palanca de retail media ya mencionada en la Fase 3</w:t>
+      </w:r>
+      <w:r>
+        <w:t xml:space="preserve"> </w:t>
+      </w:r>
+      <w:r>
+        <w:t xml:space="preserve">del roadmap (§6.3), pero a escala y con modelos más sofisticados sobre un</w:t>
+      </w:r>
+      <w:r>
+        <w:t xml:space="preserve"> </w:t>
+      </w:r>
+      <w:r>
+        <w:t xml:space="preserve">volumen mayor de datos históricos acumulados.</w:t>
+      </w:r>
+    </w:p>
+    <w:p>
+      <w:r>
+        <w:pict>
+          <v:rect style="width:0;height:1.5pt" o:hralign="center" o:hrstd="t" o:hr="t"/>
+        </w:pict>
+      </w:r>
+    </w:p>
+    <w:bookmarkEnd w:id="26"/>
+    <w:bookmarkStart w:id="27" w:name="X0d00312842f9f81d5727c71fa84e829336c6696"/>
+    <w:p>
+      <w:pPr>
+        <w:pStyle w:val="Heading2"/>
+      </w:pPr>
+      <w:r>
+        <w:t xml:space="preserve">Riesgos estructurales — respuesta corta para la defensa</w:t>
+      </w:r>
+    </w:p>
+    <w:p>
+      <w:pPr>
+        <w:pStyle w:val="FirstParagraph"/>
+      </w:pPr>
+      <w:r>
+        <w:t xml:space="preserve">Tres riesgos de fondo que el panel puede plantear. Respuesta de 20–30</w:t>
+      </w:r>
+      <w:r>
+        <w:t xml:space="preserve"> </w:t>
+      </w:r>
+      <w:r>
+        <w:t xml:space="preserve">segundos cada uno, sin improvisar datos nuevos.</w:t>
+      </w:r>
+    </w:p>
+    <w:p>
+      <w:pPr>
+        <w:pStyle w:val="BodyText"/>
+      </w:pPr>
+      <w:r>
+        <w:rPr>
+          <w:b/>
+          <w:bCs/>
+        </w:rPr>
+        <w:t xml:space="preserve">10. Reacción competitiva</w:t>
+      </w:r>
+      <w:r>
+        <w:t xml:space="preserve"> </w:t>
+      </w:r>
+      <w:r>
+        <w:rPr>
+          <w:i/>
+          <w:iCs/>
+        </w:rPr>
+        <w:t xml:space="preserve">“MP/MODO bajan su costo para COTO — pierden diferencial y market share</w:t>
+      </w:r>
+      <w:r>
+        <w:rPr>
+          <w:i/>
+          <w:iCs/>
+        </w:rPr>
+        <w:t xml:space="preserve"> </w:t>
+      </w:r>
+      <w:r>
+        <w:rPr>
+          <w:i/>
+          <w:iCs/>
+        </w:rPr>
+        <w:t xml:space="preserve">antes de llegar a masa crítica.”</w:t>
+      </w:r>
+      <w:r>
+        <w:t xml:space="preserve"> </w:t>
+      </w:r>
+      <w:r>
+        <w:t xml:space="preserve">&gt; Respuesta corta:</w:t>
+      </w:r>
+      <w:r>
+        <w:t xml:space="preserve"> </w:t>
+      </w:r>
+      <w:r>
+        <w:t xml:space="preserve">“El plan contempla un escenario dinámico. El moat no</w:t>
+      </w:r>
+      <w:r>
+        <w:t xml:space="preserve"> </w:t>
+      </w:r>
+      <w:r>
+        <w:t xml:space="preserve">&gt; está solo en el precio sino en el historial de compra acumulado —</w:t>
+      </w:r>
+      <w:r>
+        <w:t xml:space="preserve"> </w:t>
+      </w:r>
+      <w:r>
+        <w:t xml:space="preserve">&gt; MP/MODO solo ven el movimiento de dinero, no la canasta. Ese historial</w:t>
+      </w:r>
+      <w:r>
+        <w:t xml:space="preserve"> </w:t>
+      </w:r>
+      <w:r>
+        <w:t xml:space="preserve">&gt; es el activo que COTO empieza a construir desde el día 1 y que no se</w:t>
+      </w:r>
+      <w:r>
+        <w:t xml:space="preserve"> </w:t>
+      </w:r>
+      <w:r>
+        <w:t xml:space="preserve">&gt; puede replicar instantáneamente aunque la competencia baje el costo.”</w:t>
+      </w:r>
+    </w:p>
+    <w:p>
+      <w:pPr>
+        <w:pStyle w:val="BodyText"/>
+      </w:pPr>
+      <w:r>
+        <w:rPr>
+          <w:b/>
+          <w:bCs/>
+        </w:rPr>
+        <w:t xml:space="preserve">11. Gestión de producto financiero</w:t>
+      </w:r>
+      <w:r>
+        <w:t xml:space="preserve"> </w:t>
+      </w:r>
+      <w:r>
+        <w:rPr>
+          <w:i/>
+          <w:iCs/>
+        </w:rPr>
+        <w:t xml:space="preserve">“COTO no tiene experiencia operando un instrumento financiero regulado —</w:t>
+      </w:r>
+      <w:r>
+        <w:rPr>
+          <w:i/>
+          <w:iCs/>
+        </w:rPr>
+        <w:t xml:space="preserve"> </w:t>
+      </w:r>
+      <w:r>
+        <w:rPr>
+          <w:i/>
+          <w:iCs/>
+        </w:rPr>
+        <w:t xml:space="preserve">riesgo en compliance y atención al cliente.”</w:t>
+      </w:r>
+      <w:r>
+        <w:t xml:space="preserve"> </w:t>
+      </w:r>
+      <w:r>
+        <w:t xml:space="preserve">&gt; Respuesta corta:</w:t>
+      </w:r>
+      <w:r>
+        <w:t xml:space="preserve"> </w:t>
+      </w:r>
+      <w:r>
+        <w:t xml:space="preserve">“Se mitiga con el partnership PSP/BaaS que trae el</w:t>
+      </w:r>
+      <w:r>
+        <w:t xml:space="preserve"> </w:t>
+      </w:r>
+      <w:r>
+        <w:t xml:space="preserve">&gt; know-how regulatorio. COTO opera la relación comercial, no la</w:t>
+      </w:r>
+      <w:r>
+        <w:t xml:space="preserve"> </w:t>
+      </w:r>
+      <w:r>
+        <w:t xml:space="preserve">&gt; infraestructura bancaria — el socio es el responsable regulado. Eso ya</w:t>
+      </w:r>
+      <w:r>
+        <w:t xml:space="preserve"> </w:t>
+      </w:r>
+      <w:r>
+        <w:t xml:space="preserve">&gt; está contemplado en la decisión de no ir por licencia bancaria propia.”</w:t>
+      </w:r>
+    </w:p>
+    <w:p>
+      <w:pPr>
+        <w:pStyle w:val="BodyText"/>
+      </w:pPr>
+      <w:r>
+        <w:rPr>
+          <w:b/>
+          <w:bCs/>
+        </w:rPr>
+        <w:t xml:space="preserve">12. Agresividad asimétrica</w:t>
+      </w:r>
+      <w:r>
+        <w:t xml:space="preserve"> </w:t>
+      </w:r>
+      <w:r>
+        <w:rPr>
+          <w:i/>
+          <w:iCs/>
+        </w:rPr>
+        <w:t xml:space="preserve">“La competencia no va a reaccionar igual sino que va a cambiar las</w:t>
+      </w:r>
+      <w:r>
+        <w:rPr>
+          <w:i/>
+          <w:iCs/>
+        </w:rPr>
+        <w:t xml:space="preserve"> </w:t>
+      </w:r>
+      <w:r>
+        <w:rPr>
+          <w:i/>
+          <w:iCs/>
+        </w:rPr>
+        <w:t xml:space="preserve">reglas del juego.”</w:t>
+      </w:r>
+      <w:r>
+        <w:t xml:space="preserve"> </w:t>
+      </w:r>
+      <w:r>
+        <w:t xml:space="preserve">&gt; Respuesta corta:</w:t>
+      </w:r>
+      <w:r>
+        <w:t xml:space="preserve"> </w:t>
+      </w:r>
+      <w:r>
+        <w:t xml:space="preserve">“El roadmap por fases con gates de decisión explícitos</w:t>
+      </w:r>
+      <w:r>
+        <w:t xml:space="preserve"> </w:t>
+      </w:r>
+      <w:r>
+        <w:t xml:space="preserve">&gt; permite pivotar en base a cómo reacciona el mercado. El compromiso de</w:t>
+      </w:r>
+      <w:r>
+        <w:t xml:space="preserve"> </w:t>
+      </w:r>
+      <w:r>
+        <w:t xml:space="preserve">&gt; hoy es solo la Fase 0 — exactamente el nivel de decisión que genera la</w:t>
+      </w:r>
+      <w:r>
+        <w:t xml:space="preserve"> </w:t>
+      </w:r>
+      <w:r>
+        <w:t xml:space="preserve">&gt; información necesaria para ver cómo se mueve la competencia antes de</w:t>
+      </w:r>
+      <w:r>
+        <w:t xml:space="preserve"> </w:t>
+      </w:r>
+      <w:r>
+        <w:t xml:space="preserve">&gt; escalar.”</w:t>
+      </w:r>
+    </w:p>
+    <w:p>
+      <w:r>
+        <w:pict>
+          <v:rect style="width:0;height:1.5pt" o:hralign="center" o:hrstd="t" o:hr="t"/>
+        </w:pict>
+      </w:r>
+    </w:p>
+    <w:bookmarkEnd w:id="27"/>
+    <w:bookmarkStart w:id="28" w:name="notas-de-uso-de-este-guion"/>
     <w:p>
       <w:pPr>
         <w:pStyle w:val="Heading2"/>
@@ -4627,8 +5481,8 @@
         <w:t xml:space="preserve">improvisar una cifra nueva frente al panel.</w:t>
       </w:r>
     </w:p>
-    <w:bookmarkEnd w:id="26"/>
-    <w:bookmarkEnd w:id="27"/>
+    <w:bookmarkEnd w:id="28"/>
+    <w:bookmarkEnd w:id="29"/>
     <w:sectPr>
       <w:footnotePr>
         <w:numRestart w:val="eachSect"/>

</xml_diff>

<commit_message>
guion(mt10+mt25): sincronizar cada guion con su presentación actual
MT25: sección Solución pasa a los 4 pilares (antes describía los 3
viejos); el límite honesto ahora aclara que "Nuevos servicios
financieros" es visión de largo plazo, no scope del piloto — resuelve
la contradicción con el resto del guion. Minutado corrige el nombre de
§3 a "Propósito de COMUNIDAD COTO". Limpieza de separadores duplicados
tras el reorden de Evolutivos/Riesgos.

MT10: el guion ahora menciona las nueve etapas del To-Be (con el paso 0
de bienvenida) en vez de asumir el mismo conteo que el As-Is.

Co-Authored-By: Claude Sonnet 5 <noreply@anthropic.com>
</commit_message>
<xml_diff>
--- a/materias/mt25-estrategias-negocios-internet/business-plan-coto/entregable/presentacion/guion.docx
+++ b/materias/mt25-estrategias-negocios-internet/business-plan-coto/entregable/presentacion/guion.docx
@@ -818,7 +818,7 @@
               <w:pStyle w:val="Compact"/>
             </w:pPr>
             <w:r>
-              <w:t xml:space="preserve">Propósito de la empresa</w:t>
+              <w:t xml:space="preserve">Propósito de COMUNIDAD COTO</w:t>
             </w:r>
           </w:p>
         </w:tc>
@@ -1980,7 +1980,7 @@
           <w:b/>
           <w:bCs/>
         </w:rPr>
-        <w:t xml:space="preserve">Los tres pilares en orden, decirlos explícito</w:t>
+        <w:t xml:space="preserve">Los cuatro pilares en orden, decirlos explícito</w:t>
       </w:r>
       <w:r>
         <w:t xml:space="preserve"> </w:t>
@@ -2002,16 +2002,22 @@
           <w:b/>
           <w:bCs/>
         </w:rPr>
-        <w:t xml:space="preserve">Fidelización</w:t>
-      </w:r>
-      <w:r>
-        <w:t xml:space="preserve">: CotoPay construye la relación directa y continua de</w:t>
-      </w:r>
-      <w:r>
-        <w:t xml:space="preserve"> </w:t>
-      </w:r>
-      <w:r>
-        <w:t xml:space="preserve">COTO con su cliente — sin depender de que un tercero la intermedie.</w:t>
+        <w:t xml:space="preserve">Beneficios personalizados</w:t>
+      </w:r>
+      <w:r>
+        <w:t xml:space="preserve">: según historial real de compra</w:t>
+      </w:r>
+      <w:r>
+        <w:t xml:space="preserve"> </w:t>
+      </w:r>
+      <w:r>
+        <w:t xml:space="preserve">(categoría, frecuencia, ticket) — no un % genérico por rubro como</w:t>
+      </w:r>
+      <w:r>
+        <w:t xml:space="preserve"> </w:t>
+      </w:r>
+      <w:r>
+        <w:t xml:space="preserve">Cuenta DNI, ni dependiente de Meli+ como MP.</w:t>
       </w:r>
       <w:r>
         <w:t xml:space="preserve"> </w:t>
@@ -2027,22 +2033,40 @@
           <w:b/>
           <w:bCs/>
         </w:rPr>
-        <w:t xml:space="preserve">Beneficios personalizados</w:t>
-      </w:r>
-      <w:r>
-        <w:t xml:space="preserve">: según historial real de compra</w:t>
-      </w:r>
-      <w:r>
-        <w:t xml:space="preserve"> </w:t>
-      </w:r>
-      <w:r>
-        <w:t xml:space="preserve">(categoría, frecuencia, ticket) — no un % genérico por rubro como</w:t>
-      </w:r>
-      <w:r>
-        <w:t xml:space="preserve"> </w:t>
-      </w:r>
-      <w:r>
-        <w:t xml:space="preserve">Cuenta DNI, ni dependiente de Meli+ como MP.</w:t>
+        <w:t xml:space="preserve">Fidelización dentro del pago</w:t>
+      </w:r>
+      <w:r>
+        <w:t xml:space="preserve">: vive dentro del mismo instrumento de</w:t>
+      </w:r>
+      <w:r>
+        <w:t xml:space="preserve"> </w:t>
+      </w:r>
+      <w:r>
+        <w:t xml:space="preserve">pago, sin tarjeta aparte — ningún competidor integra</w:t>
+      </w:r>
+      <w:r>
+        <w:t xml:space="preserve"> </w:t>
+      </w:r>
+      <w:r>
+        <w:t xml:space="preserve">“beneficio”</w:t>
+      </w:r>
+      <w:r>
+        <w:t xml:space="preserve"> </w:t>
+      </w:r>
+      <w:r>
+        <w:t xml:space="preserve">y</w:t>
+      </w:r>
+      <w:r>
+        <w:t xml:space="preserve"> </w:t>
+      </w:r>
+      <w:r>
+        <w:t xml:space="preserve">“pago”</w:t>
+      </w:r>
+      <w:r>
+        <w:t xml:space="preserve"> </w:t>
+      </w:r>
+      <w:r>
+        <w:t xml:space="preserve">en el mismo QR con reglas fijas y visibles.</w:t>
       </w:r>
       <w:r>
         <w:t xml:space="preserve"> </w:t>
@@ -2058,40 +2082,47 @@
           <w:b/>
           <w:bCs/>
         </w:rPr>
-        <w:t xml:space="preserve">Medio de pago embebido</w:t>
-      </w:r>
-      <w:r>
-        <w:t xml:space="preserve">: la fidelización vive dentro del mismo</w:t>
-      </w:r>
-      <w:r>
-        <w:t xml:space="preserve"> </w:t>
-      </w:r>
-      <w:r>
-        <w:t xml:space="preserve">instrumento de pago, sin tarjeta aparte — ningún competidor integra</w:t>
-      </w:r>
-      <w:r>
-        <w:t xml:space="preserve"> </w:t>
-      </w:r>
-      <w:r>
-        <w:t xml:space="preserve">“beneficio”</w:t>
-      </w:r>
-      <w:r>
-        <w:t xml:space="preserve"> </w:t>
-      </w:r>
-      <w:r>
-        <w:t xml:space="preserve">y</w:t>
-      </w:r>
-      <w:r>
-        <w:t xml:space="preserve"> </w:t>
-      </w:r>
-      <w:r>
-        <w:t xml:space="preserve">“pago”</w:t>
-      </w:r>
-      <w:r>
-        <w:t xml:space="preserve"> </w:t>
-      </w:r>
-      <w:r>
-        <w:t xml:space="preserve">en el mismo QR con reglas fijas y visibles.</w:t>
+        <w:t xml:space="preserve">Coto Digital</w:t>
+      </w:r>
+      <w:r>
+        <w:t xml:space="preserve">: la wallet amplía la Comunidad COTO al canal</w:t>
+      </w:r>
+      <w:r>
+        <w:t xml:space="preserve"> </w:t>
+      </w:r>
+      <w:r>
+        <w:t xml:space="preserve">e-commerce, no solo a la sucursal física.</w:t>
+      </w:r>
+      <w:r>
+        <w:t xml:space="preserve"> </w:t>
+      </w:r>
+      <w:r>
+        <w:t xml:space="preserve">4.</w:t>
+      </w:r>
+      <w:r>
+        <w:t xml:space="preserve"> </w:t>
+      </w:r>
+      <w:r>
+        <w:rPr>
+          <w:b/>
+          <w:bCs/>
+        </w:rPr>
+        <w:t xml:space="preserve">Nuevos servicios financieros</w:t>
+      </w:r>
+      <w:r>
+        <w:t xml:space="preserve">: tarjetas, micropréstamos, cuenta en</w:t>
+      </w:r>
+      <w:r>
+        <w:t xml:space="preserve"> </w:t>
+      </w:r>
+      <w:r>
+        <w:t xml:space="preserve">dólares, cuenta remunerada — visión de largo plazo, no del piloto (se</w:t>
+      </w:r>
+      <w:r>
+        <w:t xml:space="preserve"> </w:t>
+      </w:r>
+      <w:r>
+        <w:t xml:space="preserve">retoma en Evolutivos, después del Anexo).</w:t>
       </w:r>
     </w:p>
     <w:p>
@@ -2143,13 +2174,19 @@
         <w:t xml:space="preserve"> </w:t>
       </w:r>
       <w:r>
-        <w:t xml:space="preserve">tiempo. No hay inversión, crédito, cuenta remunerada ni IA generativa en</w:t>
-      </w:r>
-      <w:r>
-        <w:t xml:space="preserve"> </w:t>
-      </w:r>
-      <w:r>
-        <w:t xml:space="preserve">esta fase — la personalización es segmentación/analítica sobre historial</w:t>
+        <w:t xml:space="preserve">tiempo. El pilar 4 (servicios financieros) es visión, no scope del piloto:</w:t>
+      </w:r>
+      <w:r>
+        <w:t xml:space="preserve"> </w:t>
+      </w:r>
+      <w:r>
+        <w:t xml:space="preserve">la Fase 0-1 no incluye inversión, crédito, cuenta remunerada ni IA</w:t>
+      </w:r>
+      <w:r>
+        <w:t xml:space="preserve"> </w:t>
+      </w:r>
+      <w:r>
+        <w:t xml:space="preserve">generativa — la personalización es segmentación/analítica sobre historial</w:t>
       </w:r>
       <w:r>
         <w:t xml:space="preserve"> </w:t>
@@ -4765,13 +4802,6 @@
       </w:r>
       <w:r>
         <w:t xml:space="preserve">&gt; mínimo porque no hay benchmark citado para hacerlo hoy.”</w:t>
-      </w:r>
-    </w:p>
-    <w:p>
-      <w:r>
-        <w:pict>
-          <v:rect style="width:0;height:1.5pt" o:hralign="center" o:hrstd="t" o:hr="t"/>
-        </w:pict>
       </w:r>
     </w:p>
     <w:p>

</xml_diff>